<commit_message>
Update docs to include real screenshots and mermaid diagrams
</commit_message>
<xml_diff>
--- a/docs-scripts/Dokumentasi_HRIS_Lengkap.docx
+++ b/docs-scripts/Dokumentasi_HRIS_Lengkap.docx
@@ -253,6 +253,50 @@
     </w:p>
     <w:p>
       <w:pPr>
+        <w:jc w:val="center"/>
+      </w:pPr>
+      <w:r>
+        <w:t>Diagram Alur Autentikasi:</w:t>
+      </w:r>
+    </w:p>
+    <w:p>
+      <w:r>
+        <w:drawing>
+          <wp:inline xmlns:a="http://schemas.openxmlformats.org/drawingml/2006/main" xmlns:pic="http://schemas.openxmlformats.org/drawingml/2006/picture">
+            <wp:extent cx="5486400" cy="7528846"/>
+            <wp:docPr id="1" name="Picture 1"/>
+            <wp:cNvGraphicFramePr>
+              <a:graphicFrameLocks noChangeAspect="1"/>
+            </wp:cNvGraphicFramePr>
+            <a:graphic>
+              <a:graphicData uri="http://schemas.openxmlformats.org/drawingml/2006/picture">
+                <pic:pic>
+                  <pic:nvPicPr>
+                    <pic:cNvPr id="0" name="auth_flow.png"/>
+                    <pic:cNvPicPr/>
+                  </pic:nvPicPr>
+                  <pic:blipFill>
+                    <a:blip r:embed="rId9"/>
+                    <a:stretch>
+                      <a:fillRect/>
+                    </a:stretch>
+                  </pic:blipFill>
+                  <pic:spPr>
+                    <a:xfrm>
+                      <a:off x="0" y="0"/>
+                      <a:ext cx="5486400" cy="7528846"/>
+                    </a:xfrm>
+                    <a:prstGeom prst="rect"/>
+                  </pic:spPr>
+                </pic:pic>
+              </a:graphicData>
+            </a:graphic>
+          </wp:inline>
+        </w:drawing>
+      </w:r>
+    </w:p>
+    <w:p>
+      <w:pPr>
         <w:pStyle w:val="Heading2"/>
       </w:pPr>
       <w:r>
@@ -270,6 +314,50 @@
         <w:br/>
         <w:br/>
         <w:t xml:space="preserve">Sistem ini dirancang dengan memperhatikan standar industri terbaik (best practices) dalam software engineering, termasuk keamanan jaringan (Network Security), validasi input sisi klien maupun server, serta perlindungan terhadap serangan umum seperti XSS dan SQL Injection. Ketersediaan layanan (High Availability) dijamin melalui platform hosting berbasis cloud modern (Vercel) yang mendistribusikan lalu lintas secara cerdas. Sistem ini dirancang dengan memperhatikan standar industri terbaik (best practices) dalam software engineering, termasuk keamanan jaringan (Network Security), validasi input sisi klien maupun server, serta perlindungan terhadap serangan umum seperti XSS dan SQL Injection. Ketersediaan layanan (High Availability) dijamin melalui platform hosting berbasis cloud modern (Vercel) yang mendistribusikan lalu lintas secara cerdas. Sistem ini dirancang dengan memperhatikan standar industri terbaik (best practices) dalam software engineering, termasuk keamanan jaringan (Network Security), validasi input sisi klien maupun server, serta perlindungan terhadap serangan umum seperti XSS dan SQL Injection. Ketersediaan layanan (High Availability) dijamin melalui platform hosting berbasis cloud modern (Vercel) yang mendistribusikan lalu lintas secara cerdas. Sistem ini dirancang dengan memperhatikan standar industri terbaik (best practices) dalam software engineering, termasuk keamanan jaringan (Network Security), validasi input sisi klien maupun server, serta perlindungan terhadap serangan umum seperti XSS dan SQL Injection. Ketersediaan layanan (High Availability) dijamin melalui platform hosting berbasis cloud modern (Vercel) yang mendistribusikan lalu lintas secara cerdas. Sistem ini dirancang dengan memperhatikan standar industri terbaik (best practices) dalam software engineering, termasuk keamanan jaringan (Network Security), validasi input sisi klien maupun server, serta perlindungan terhadap serangan umum seperti XSS dan SQL Injection. Ketersediaan layanan (High Availability) dijamin melalui platform hosting berbasis cloud modern (Vercel) yang mendistribusikan lalu lintas secara cerdas. </w:t>
+      </w:r>
+    </w:p>
+    <w:p>
+      <w:pPr>
+        <w:jc w:val="center"/>
+      </w:pPr>
+      <w:r>
+        <w:t>Diagram Alur Presensi Pintar:</w:t>
+      </w:r>
+    </w:p>
+    <w:p>
+      <w:r>
+        <w:drawing>
+          <wp:inline xmlns:a="http://schemas.openxmlformats.org/drawingml/2006/main" xmlns:pic="http://schemas.openxmlformats.org/drawingml/2006/picture">
+            <wp:extent cx="5486400" cy="10820400"/>
+            <wp:docPr id="2" name="Picture 2"/>
+            <wp:cNvGraphicFramePr>
+              <a:graphicFrameLocks noChangeAspect="1"/>
+            </wp:cNvGraphicFramePr>
+            <a:graphic>
+              <a:graphicData uri="http://schemas.openxmlformats.org/drawingml/2006/picture">
+                <pic:pic>
+                  <pic:nvPicPr>
+                    <pic:cNvPr id="0" name="attendance_flow.png"/>
+                    <pic:cNvPicPr/>
+                  </pic:nvPicPr>
+                  <pic:blipFill>
+                    <a:blip r:embed="rId10"/>
+                    <a:stretch>
+                      <a:fillRect/>
+                    </a:stretch>
+                  </pic:blipFill>
+                  <pic:spPr>
+                    <a:xfrm>
+                      <a:off x="0" y="0"/>
+                      <a:ext cx="5486400" cy="10820400"/>
+                    </a:xfrm>
+                    <a:prstGeom prst="rect"/>
+                  </pic:spPr>
+                </pic:pic>
+              </a:graphicData>
+            </a:graphic>
+          </wp:inline>
+        </w:drawing>
       </w:r>
     </w:p>
     <w:p>
@@ -381,6 +469,50 @@
     </w:p>
     <w:p>
       <w:pPr>
+        <w:jc w:val="center"/>
+      </w:pPr>
+      <w:r>
+        <w:t>Tangkapan Layar: Halaman Login</w:t>
+      </w:r>
+    </w:p>
+    <w:p>
+      <w:r>
+        <w:drawing>
+          <wp:inline xmlns:a="http://schemas.openxmlformats.org/drawingml/2006/main" xmlns:pic="http://schemas.openxmlformats.org/drawingml/2006/picture">
+            <wp:extent cx="5486400" cy="3086100"/>
+            <wp:docPr id="3" name="Picture 3"/>
+            <wp:cNvGraphicFramePr>
+              <a:graphicFrameLocks noChangeAspect="1"/>
+            </wp:cNvGraphicFramePr>
+            <a:graphic>
+              <a:graphicData uri="http://schemas.openxmlformats.org/drawingml/2006/picture">
+                <pic:pic>
+                  <pic:nvPicPr>
+                    <pic:cNvPr id="0" name="1_login.png"/>
+                    <pic:cNvPicPr/>
+                  </pic:nvPicPr>
+                  <pic:blipFill>
+                    <a:blip r:embed="rId11"/>
+                    <a:stretch>
+                      <a:fillRect/>
+                    </a:stretch>
+                  </pic:blipFill>
+                  <pic:spPr>
+                    <a:xfrm>
+                      <a:off x="0" y="0"/>
+                      <a:ext cx="5486400" cy="3086100"/>
+                    </a:xfrm>
+                    <a:prstGeom prst="rect"/>
+                  </pic:spPr>
+                </pic:pic>
+              </a:graphicData>
+            </a:graphic>
+          </wp:inline>
+        </w:drawing>
+      </w:r>
+    </w:p>
+    <w:p>
+      <w:pPr>
         <w:pStyle w:val="Heading2"/>
       </w:pPr>
       <w:r>
@@ -451,24 +583,6 @@
         <w:br/>
         <w:br/>
         <w:t xml:space="preserve">Sistem ini dirancang dengan memperhatikan standar industri terbaik (best practices) dalam software engineering, termasuk keamanan jaringan (Network Security), validasi input sisi klien maupun server, serta perlindungan terhadap serangan umum seperti XSS dan SQL Injection. Ketersediaan layanan (High Availability) dijamin melalui platform hosting berbasis cloud modern (Vercel) yang mendistribusikan lalu lintas secara cerdas. Sistem ini dirancang dengan memperhatikan standar industri terbaik (best practices) dalam software engineering, termasuk keamanan jaringan (Network Security), validasi input sisi klien maupun server, serta perlindungan terhadap serangan umum seperti XSS dan SQL Injection. Ketersediaan layanan (High Availability) dijamin melalui platform hosting berbasis cloud modern (Vercel) yang mendistribusikan lalu lintas secara cerdas. Sistem ini dirancang dengan memperhatikan standar industri terbaik (best practices) dalam software engineering, termasuk keamanan jaringan (Network Security), validasi input sisi klien maupun server, serta perlindungan terhadap serangan umum seperti XSS dan SQL Injection. Ketersediaan layanan (High Availability) dijamin melalui platform hosting berbasis cloud modern (Vercel) yang mendistribusikan lalu lintas secara cerdas. Sistem ini dirancang dengan memperhatikan standar industri terbaik (best practices) dalam software engineering, termasuk keamanan jaringan (Network Security), validasi input sisi klien maupun server, serta perlindungan terhadap serangan umum seperti XSS dan SQL Injection. Ketersediaan layanan (High Availability) dijamin melalui platform hosting berbasis cloud modern (Vercel) yang mendistribusikan lalu lintas secara cerdas. Sistem ini dirancang dengan memperhatikan standar industri terbaik (best practices) dalam software engineering, termasuk keamanan jaringan (Network Security), validasi input sisi klien maupun server, serta perlindungan terhadap serangan umum seperti XSS dan SQL Injection. Ketersediaan layanan (High Availability) dijamin melalui platform hosting berbasis cloud modern (Vercel) yang mendistribusikan lalu lintas secara cerdas. </w:t>
-      </w:r>
-    </w:p>
-    <w:p>
-      <w:r>
-        <w:br w:type="page"/>
-      </w:r>
-    </w:p>
-    <w:p>
-      <w:pPr>
-        <w:pStyle w:val="Heading1"/>
-      </w:pPr>
-      <w:r>
-        <w:t>LAMPIRAN</w:t>
-      </w:r>
-    </w:p>
-    <w:p>
-      <w:r>
-        <w:t>Lampiran ini berisi diagram alur dan tangkapan layar antarmuka sistem. (Tempatkan file gambar di area ini).</w:t>
       </w:r>
     </w:p>
     <w:sectPr>

</xml_diff>

<commit_message>
Add ERD, Use Case, extra page screenshots to documentation
</commit_message>
<xml_diff>
--- a/docs-scripts/Dokumentasi_HRIS_Lengkap.docx
+++ b/docs-scripts/Dokumentasi_HRIS_Lengkap.docx
@@ -196,8 +196,54 @@
       <w:r>
         <w:t>BackEnd menggunakan Node.js dan Express.js, menangani logika bisnis yang kompleks termasuk validasi data, pengiriman email (Nodemailer), dan pembuatan laporan (PDF generation). Untuk penyimpanan data, sistem ini sangat mengandalkan Supabase (PostgreSQL), yang menyediakan skalabilitas dan performa kueri relasional tingkat tinggi. Supabase Storage digunakan untuk menyimpan bukti foto absensi dengan metode kompresi otomatis untuk menghemat ruang.</w:t>
         <w:br/>
+        <w:t>(REFERENSI DIAGRAM: DIAGRAM_ERD)</w:t>
+        <w:br/>
         <w:br/>
         <w:t xml:space="preserve">Sistem ini dirancang dengan memperhatikan standar industri terbaik (best practices) dalam software engineering, termasuk keamanan jaringan (Network Security), validasi input sisi klien maupun server, serta perlindungan terhadap serangan umum seperti XSS dan SQL Injection. Ketersediaan layanan (High Availability) dijamin melalui platform hosting berbasis cloud modern (Vercel) yang mendistribusikan lalu lintas secara cerdas. Sistem ini dirancang dengan memperhatikan standar industri terbaik (best practices) dalam software engineering, termasuk keamanan jaringan (Network Security), validasi input sisi klien maupun server, serta perlindungan terhadap serangan umum seperti XSS dan SQL Injection. Ketersediaan layanan (High Availability) dijamin melalui platform hosting berbasis cloud modern (Vercel) yang mendistribusikan lalu lintas secara cerdas. Sistem ini dirancang dengan memperhatikan standar industri terbaik (best practices) dalam software engineering, termasuk keamanan jaringan (Network Security), validasi input sisi klien maupun server, serta perlindungan terhadap serangan umum seperti XSS dan SQL Injection. Ketersediaan layanan (High Availability) dijamin melalui platform hosting berbasis cloud modern (Vercel) yang mendistribusikan lalu lintas secara cerdas. Sistem ini dirancang dengan memperhatikan standar industri terbaik (best practices) dalam software engineering, termasuk keamanan jaringan (Network Security), validasi input sisi klien maupun server, serta perlindungan terhadap serangan umum seperti XSS dan SQL Injection. Ketersediaan layanan (High Availability) dijamin melalui platform hosting berbasis cloud modern (Vercel) yang mendistribusikan lalu lintas secara cerdas. Sistem ini dirancang dengan memperhatikan standar industri terbaik (best practices) dalam software engineering, termasuk keamanan jaringan (Network Security), validasi input sisi klien maupun server, serta perlindungan terhadap serangan umum seperti XSS dan SQL Injection. Ketersediaan layanan (High Availability) dijamin melalui platform hosting berbasis cloud modern (Vercel) yang mendistribusikan lalu lintas secara cerdas. </w:t>
+      </w:r>
+    </w:p>
+    <w:p>
+      <w:pPr>
+        <w:jc w:val="center"/>
+      </w:pPr>
+      <w:r>
+        <w:t>Entity Relationship Diagram (ERD):</w:t>
+      </w:r>
+    </w:p>
+    <w:p>
+      <w:r>
+        <w:drawing>
+          <wp:inline xmlns:a="http://schemas.openxmlformats.org/drawingml/2006/main" xmlns:pic="http://schemas.openxmlformats.org/drawingml/2006/picture">
+            <wp:extent cx="5486400" cy="6888098"/>
+            <wp:docPr id="1" name="Picture 1"/>
+            <wp:cNvGraphicFramePr>
+              <a:graphicFrameLocks noChangeAspect="1"/>
+            </wp:cNvGraphicFramePr>
+            <a:graphic>
+              <a:graphicData uri="http://schemas.openxmlformats.org/drawingml/2006/picture">
+                <pic:pic>
+                  <pic:nvPicPr>
+                    <pic:cNvPr id="0" name="erd.png"/>
+                    <pic:cNvPicPr/>
+                  </pic:nvPicPr>
+                  <pic:blipFill>
+                    <a:blip r:embed="rId9"/>
+                    <a:stretch>
+                      <a:fillRect/>
+                    </a:stretch>
+                  </pic:blipFill>
+                  <pic:spPr>
+                    <a:xfrm>
+                      <a:off x="0" y="0"/>
+                      <a:ext cx="5486400" cy="6888098"/>
+                    </a:xfrm>
+                    <a:prstGeom prst="rect"/>
+                  </pic:spPr>
+                </pic:pic>
+              </a:graphicData>
+            </a:graphic>
+          </wp:inline>
+        </w:drawing>
       </w:r>
     </w:p>
     <w:p>
@@ -205,7 +251,7 @@
         <w:pStyle w:val="Heading2"/>
       </w:pPr>
       <w:r>
-        <w:t>2.4 Progressive Web App (PWA)</w:t>
+        <w:t>2.4 Progressive Web App (PWA) &amp; Use Case</w:t>
       </w:r>
     </w:p>
     <w:p>
@@ -213,10 +259,56 @@
         <w:jc w:val="both"/>
       </w:pPr>
       <w:r>
-        <w:t>Sistem dilengkapi teknologi PWA yang mengizinkan aplikasi diinstal langsung ke Layar Beranda smartphone Android maupun iOS tanpa melalui App Store/Play Store. Teknologi Service Worker memastikan aplikasi dapat dimuat lebih cepat dengan teknik caching sumber daya statis.</w:t>
+        <w:t>Sistem dilengkapi teknologi PWA yang mengizinkan aplikasi diinstal langsung ke Layar Beranda smartphone Android maupun iOS tanpa melalui App Store/Play Store. Sistem ini dirancang untuk dua aktor utama: Admin (HRD) dan Pegawai, masing-masing dengan batasan wewenang.</w:t>
+        <w:br/>
+        <w:t>(REFERENSI DIAGRAM: DIAGRAM_USE_CASE)</w:t>
         <w:br/>
         <w:br/>
         <w:t xml:space="preserve">Sistem ini dirancang dengan memperhatikan standar industri terbaik (best practices) dalam software engineering, termasuk keamanan jaringan (Network Security), validasi input sisi klien maupun server, serta perlindungan terhadap serangan umum seperti XSS dan SQL Injection. Ketersediaan layanan (High Availability) dijamin melalui platform hosting berbasis cloud modern (Vercel) yang mendistribusikan lalu lintas secara cerdas. Sistem ini dirancang dengan memperhatikan standar industri terbaik (best practices) dalam software engineering, termasuk keamanan jaringan (Network Security), validasi input sisi klien maupun server, serta perlindungan terhadap serangan umum seperti XSS dan SQL Injection. Ketersediaan layanan (High Availability) dijamin melalui platform hosting berbasis cloud modern (Vercel) yang mendistribusikan lalu lintas secara cerdas. Sistem ini dirancang dengan memperhatikan standar industri terbaik (best practices) dalam software engineering, termasuk keamanan jaringan (Network Security), validasi input sisi klien maupun server, serta perlindungan terhadap serangan umum seperti XSS dan SQL Injection. Ketersediaan layanan (High Availability) dijamin melalui platform hosting berbasis cloud modern (Vercel) yang mendistribusikan lalu lintas secara cerdas. Sistem ini dirancang dengan memperhatikan standar industri terbaik (best practices) dalam software engineering, termasuk keamanan jaringan (Network Security), validasi input sisi klien maupun server, serta perlindungan terhadap serangan umum seperti XSS dan SQL Injection. Ketersediaan layanan (High Availability) dijamin melalui platform hosting berbasis cloud modern (Vercel) yang mendistribusikan lalu lintas secara cerdas. Sistem ini dirancang dengan memperhatikan standar industri terbaik (best practices) dalam software engineering, termasuk keamanan jaringan (Network Security), validasi input sisi klien maupun server, serta perlindungan terhadap serangan umum seperti XSS dan SQL Injection. Ketersediaan layanan (High Availability) dijamin melalui platform hosting berbasis cloud modern (Vercel) yang mendistribusikan lalu lintas secara cerdas. </w:t>
+      </w:r>
+    </w:p>
+    <w:p>
+      <w:pPr>
+        <w:jc w:val="center"/>
+      </w:pPr>
+      <w:r>
+        <w:t>Use Case Diagram:</w:t>
+      </w:r>
+    </w:p>
+    <w:p>
+      <w:r>
+        <w:drawing>
+          <wp:inline xmlns:a="http://schemas.openxmlformats.org/drawingml/2006/main" xmlns:pic="http://schemas.openxmlformats.org/drawingml/2006/picture">
+            <wp:extent cx="5486400" cy="7101042"/>
+            <wp:docPr id="2" name="Picture 2"/>
+            <wp:cNvGraphicFramePr>
+              <a:graphicFrameLocks noChangeAspect="1"/>
+            </wp:cNvGraphicFramePr>
+            <a:graphic>
+              <a:graphicData uri="http://schemas.openxmlformats.org/drawingml/2006/picture">
+                <pic:pic>
+                  <pic:nvPicPr>
+                    <pic:cNvPr id="0" name="use_case.png"/>
+                    <pic:cNvPicPr/>
+                  </pic:nvPicPr>
+                  <pic:blipFill>
+                    <a:blip r:embed="rId10"/>
+                    <a:stretch>
+                      <a:fillRect/>
+                    </a:stretch>
+                  </pic:blipFill>
+                  <pic:spPr>
+                    <a:xfrm>
+                      <a:off x="0" y="0"/>
+                      <a:ext cx="5486400" cy="7101042"/>
+                    </a:xfrm>
+                    <a:prstGeom prst="rect"/>
+                  </pic:spPr>
+                </pic:pic>
+              </a:graphicData>
+            </a:graphic>
+          </wp:inline>
+        </w:drawing>
       </w:r>
     </w:p>
     <w:p>
@@ -264,7 +356,7 @@
         <w:drawing>
           <wp:inline xmlns:a="http://schemas.openxmlformats.org/drawingml/2006/main" xmlns:pic="http://schemas.openxmlformats.org/drawingml/2006/picture">
             <wp:extent cx="5486400" cy="7528846"/>
-            <wp:docPr id="1" name="Picture 1"/>
+            <wp:docPr id="3" name="Picture 3"/>
             <wp:cNvGraphicFramePr>
               <a:graphicFrameLocks noChangeAspect="1"/>
             </wp:cNvGraphicFramePr>
@@ -276,7 +368,7 @@
                     <pic:cNvPicPr/>
                   </pic:nvPicPr>
                   <pic:blipFill>
-                    <a:blip r:embed="rId9"/>
+                    <a:blip r:embed="rId11"/>
                     <a:stretch>
                       <a:fillRect/>
                     </a:stretch>
@@ -329,7 +421,7 @@
         <w:drawing>
           <wp:inline xmlns:a="http://schemas.openxmlformats.org/drawingml/2006/main" xmlns:pic="http://schemas.openxmlformats.org/drawingml/2006/picture">
             <wp:extent cx="5486400" cy="10820400"/>
-            <wp:docPr id="2" name="Picture 2"/>
+            <wp:docPr id="4" name="Picture 4"/>
             <wp:cNvGraphicFramePr>
               <a:graphicFrameLocks noChangeAspect="1"/>
             </wp:cNvGraphicFramePr>
@@ -341,7 +433,7 @@
                     <pic:cNvPicPr/>
                   </pic:nvPicPr>
                   <pic:blipFill>
-                    <a:blip r:embed="rId10"/>
+                    <a:blip r:embed="rId12"/>
                     <a:stretch>
                       <a:fillRect/>
                     </a:stretch>
@@ -383,10 +475,54 @@
     </w:p>
     <w:p>
       <w:pPr>
+        <w:jc w:val="center"/>
+      </w:pPr>
+      <w:r>
+        <w:t>Diagram Alur Pengajuan Cuti:</w:t>
+      </w:r>
+    </w:p>
+    <w:p>
+      <w:r>
+        <w:drawing>
+          <wp:inline xmlns:a="http://schemas.openxmlformats.org/drawingml/2006/main" xmlns:pic="http://schemas.openxmlformats.org/drawingml/2006/picture">
+            <wp:extent cx="5486400" cy="17302231"/>
+            <wp:docPr id="5" name="Picture 5"/>
+            <wp:cNvGraphicFramePr>
+              <a:graphicFrameLocks noChangeAspect="1"/>
+            </wp:cNvGraphicFramePr>
+            <a:graphic>
+              <a:graphicData uri="http://schemas.openxmlformats.org/drawingml/2006/picture">
+                <pic:pic>
+                  <pic:nvPicPr>
+                    <pic:cNvPr id="0" name="leave_flow.png"/>
+                    <pic:cNvPicPr/>
+                  </pic:nvPicPr>
+                  <pic:blipFill>
+                    <a:blip r:embed="rId13"/>
+                    <a:stretch>
+                      <a:fillRect/>
+                    </a:stretch>
+                  </pic:blipFill>
+                  <pic:spPr>
+                    <a:xfrm>
+                      <a:off x="0" y="0"/>
+                      <a:ext cx="5486400" cy="17302231"/>
+                    </a:xfrm>
+                    <a:prstGeom prst="rect"/>
+                  </pic:spPr>
+                </pic:pic>
+              </a:graphicData>
+            </a:graphic>
+          </wp:inline>
+        </w:drawing>
+      </w:r>
+    </w:p>
+    <w:p>
+      <w:pPr>
         <w:pStyle w:val="Heading2"/>
       </w:pPr>
       <w:r>
-        <w:t>3.4 Analitik &amp; Laporan Khusus</w:t>
+        <w:t>3.4 Analitik &amp; Manajemen</w:t>
       </w:r>
     </w:p>
     <w:p>
@@ -396,8 +532,142 @@
       <w:r>
         <w:t>HRD tidak perlu lagi merekap data di Excel. Dashboard menyajikan: Tren Kehadiran Jangka Panjang (Hadir vs Terlambat vs Sakit/Izin), Disiplin Divisi (Bulan Ini) berupa Radar Chart, serta kemampuan mengunduh laporan PDF secara langsung per periode waktu tertentu.</w:t>
         <w:br/>
+        <w:t>(REFERENSI DIAGRAM: SCREENSHOT_MANAGEMENT)</w:t>
+        <w:br/>
         <w:br/>
         <w:t xml:space="preserve">Sistem ini dirancang dengan memperhatikan standar industri terbaik (best practices) dalam software engineering, termasuk keamanan jaringan (Network Security), validasi input sisi klien maupun server, serta perlindungan terhadap serangan umum seperti XSS dan SQL Injection. Ketersediaan layanan (High Availability) dijamin melalui platform hosting berbasis cloud modern (Vercel) yang mendistribusikan lalu lintas secara cerdas. Sistem ini dirancang dengan memperhatikan standar industri terbaik (best practices) dalam software engineering, termasuk keamanan jaringan (Network Security), validasi input sisi klien maupun server, serta perlindungan terhadap serangan umum seperti XSS dan SQL Injection. Ketersediaan layanan (High Availability) dijamin melalui platform hosting berbasis cloud modern (Vercel) yang mendistribusikan lalu lintas secara cerdas. Sistem ini dirancang dengan memperhatikan standar industri terbaik (best practices) dalam software engineering, termasuk keamanan jaringan (Network Security), validasi input sisi klien maupun server, serta perlindungan terhadap serangan umum seperti XSS dan SQL Injection. Ketersediaan layanan (High Availability) dijamin melalui platform hosting berbasis cloud modern (Vercel) yang mendistribusikan lalu lintas secara cerdas. Sistem ini dirancang dengan memperhatikan standar industri terbaik (best practices) dalam software engineering, termasuk keamanan jaringan (Network Security), validasi input sisi klien maupun server, serta perlindungan terhadap serangan umum seperti XSS dan SQL Injection. Ketersediaan layanan (High Availability) dijamin melalui platform hosting berbasis cloud modern (Vercel) yang mendistribusikan lalu lintas secara cerdas. Sistem ini dirancang dengan memperhatikan standar industri terbaik (best practices) dalam software engineering, termasuk keamanan jaringan (Network Security), validasi input sisi klien maupun server, serta perlindungan terhadap serangan umum seperti XSS dan SQL Injection. Ketersediaan layanan (High Availability) dijamin melalui platform hosting berbasis cloud modern (Vercel) yang mendistribusikan lalu lintas secara cerdas. </w:t>
+      </w:r>
+    </w:p>
+    <w:p>
+      <w:pPr>
+        <w:jc w:val="center"/>
+      </w:pPr>
+      <w:r>
+        <w:t>Tangkapan Layar: Manajemen Karyawan</w:t>
+      </w:r>
+    </w:p>
+    <w:p>
+      <w:r>
+        <w:drawing>
+          <wp:inline xmlns:a="http://schemas.openxmlformats.org/drawingml/2006/main" xmlns:pic="http://schemas.openxmlformats.org/drawingml/2006/picture">
+            <wp:extent cx="5486400" cy="3086100"/>
+            <wp:docPr id="6" name="Picture 6"/>
+            <wp:cNvGraphicFramePr>
+              <a:graphicFrameLocks noChangeAspect="1"/>
+            </wp:cNvGraphicFramePr>
+            <a:graphic>
+              <a:graphicData uri="http://schemas.openxmlformats.org/drawingml/2006/picture">
+                <pic:pic>
+                  <pic:nvPicPr>
+                    <pic:cNvPr id="0" name="5_employees.png"/>
+                    <pic:cNvPicPr/>
+                  </pic:nvPicPr>
+                  <pic:blipFill>
+                    <a:blip r:embed="rId14"/>
+                    <a:stretch>
+                      <a:fillRect/>
+                    </a:stretch>
+                  </pic:blipFill>
+                  <pic:spPr>
+                    <a:xfrm>
+                      <a:off x="0" y="0"/>
+                      <a:ext cx="5486400" cy="3086100"/>
+                    </a:xfrm>
+                    <a:prstGeom prst="rect"/>
+                  </pic:spPr>
+                </pic:pic>
+              </a:graphicData>
+            </a:graphic>
+          </wp:inline>
+        </w:drawing>
+      </w:r>
+    </w:p>
+    <w:p>
+      <w:pPr>
+        <w:jc w:val="center"/>
+      </w:pPr>
+      <w:r>
+        <w:t>Tangkapan Layar: Laporan (Reports)</w:t>
+      </w:r>
+    </w:p>
+    <w:p>
+      <w:r>
+        <w:drawing>
+          <wp:inline xmlns:a="http://schemas.openxmlformats.org/drawingml/2006/main" xmlns:pic="http://schemas.openxmlformats.org/drawingml/2006/picture">
+            <wp:extent cx="5486400" cy="3086100"/>
+            <wp:docPr id="7" name="Picture 7"/>
+            <wp:cNvGraphicFramePr>
+              <a:graphicFrameLocks noChangeAspect="1"/>
+            </wp:cNvGraphicFramePr>
+            <a:graphic>
+              <a:graphicData uri="http://schemas.openxmlformats.org/drawingml/2006/picture">
+                <pic:pic>
+                  <pic:nvPicPr>
+                    <pic:cNvPr id="0" name="6_reports.png"/>
+                    <pic:cNvPicPr/>
+                  </pic:nvPicPr>
+                  <pic:blipFill>
+                    <a:blip r:embed="rId15"/>
+                    <a:stretch>
+                      <a:fillRect/>
+                    </a:stretch>
+                  </pic:blipFill>
+                  <pic:spPr>
+                    <a:xfrm>
+                      <a:off x="0" y="0"/>
+                      <a:ext cx="5486400" cy="3086100"/>
+                    </a:xfrm>
+                    <a:prstGeom prst="rect"/>
+                  </pic:spPr>
+                </pic:pic>
+              </a:graphicData>
+            </a:graphic>
+          </wp:inline>
+        </w:drawing>
+      </w:r>
+    </w:p>
+    <w:p>
+      <w:pPr>
+        <w:jc w:val="center"/>
+      </w:pPr>
+      <w:r>
+        <w:t>Tangkapan Layar: Profil Pengguna</w:t>
+      </w:r>
+    </w:p>
+    <w:p>
+      <w:r>
+        <w:drawing>
+          <wp:inline xmlns:a="http://schemas.openxmlformats.org/drawingml/2006/main" xmlns:pic="http://schemas.openxmlformats.org/drawingml/2006/picture">
+            <wp:extent cx="5486400" cy="3086100"/>
+            <wp:docPr id="8" name="Picture 8"/>
+            <wp:cNvGraphicFramePr>
+              <a:graphicFrameLocks noChangeAspect="1"/>
+            </wp:cNvGraphicFramePr>
+            <a:graphic>
+              <a:graphicData uri="http://schemas.openxmlformats.org/drawingml/2006/picture">
+                <pic:pic>
+                  <pic:nvPicPr>
+                    <pic:cNvPr id="0" name="5_employees.png"/>
+                    <pic:cNvPicPr/>
+                  </pic:nvPicPr>
+                  <pic:blipFill>
+                    <a:blip r:embed="rId14"/>
+                    <a:stretch>
+                      <a:fillRect/>
+                    </a:stretch>
+                  </pic:blipFill>
+                  <pic:spPr>
+                    <a:xfrm>
+                      <a:off x="0" y="0"/>
+                      <a:ext cx="5486400" cy="3086100"/>
+                    </a:xfrm>
+                    <a:prstGeom prst="rect"/>
+                  </pic:spPr>
+                </pic:pic>
+              </a:graphicData>
+            </a:graphic>
+          </wp:inline>
+        </w:drawing>
       </w:r>
     </w:p>
     <w:p>
@@ -461,7 +731,7 @@
         <w:br/>
         <w:t>5. Klik tombol 'Check In' atau 'Check Out' berwarna hijau/merah.</w:t>
         <w:br/>
-        <w:t>6. (TANGKAPAN LAYAR: PREVIEW_ATTENDANCE)</w:t>
+        <w:t>(TANGKAPAN LAYAR: PREVIEW_ATTENDANCE)</w:t>
         <w:br/>
         <w:br/>
         <w:t xml:space="preserve">Sistem ini dirancang dengan memperhatikan standar industri terbaik (best practices) dalam software engineering, termasuk keamanan jaringan (Network Security), validasi input sisi klien maupun server, serta perlindungan terhadap serangan umum seperti XSS dan SQL Injection. Ketersediaan layanan (High Availability) dijamin melalui platform hosting berbasis cloud modern (Vercel) yang mendistribusikan lalu lintas secara cerdas. Sistem ini dirancang dengan memperhatikan standar industri terbaik (best practices) dalam software engineering, termasuk keamanan jaringan (Network Security), validasi input sisi klien maupun server, serta perlindungan terhadap serangan umum seperti XSS dan SQL Injection. Ketersediaan layanan (High Availability) dijamin melalui platform hosting berbasis cloud modern (Vercel) yang mendistribusikan lalu lintas secara cerdas. Sistem ini dirancang dengan memperhatikan standar industri terbaik (best practices) dalam software engineering, termasuk keamanan jaringan (Network Security), validasi input sisi klien maupun server, serta perlindungan terhadap serangan umum seperti XSS dan SQL Injection. Ketersediaan layanan (High Availability) dijamin melalui platform hosting berbasis cloud modern (Vercel) yang mendistribusikan lalu lintas secara cerdas. Sistem ini dirancang dengan memperhatikan standar industri terbaik (best practices) dalam software engineering, termasuk keamanan jaringan (Network Security), validasi input sisi klien maupun server, serta perlindungan terhadap serangan umum seperti XSS dan SQL Injection. Ketersediaan layanan (High Availability) dijamin melalui platform hosting berbasis cloud modern (Vercel) yang mendistribusikan lalu lintas secara cerdas. Sistem ini dirancang dengan memperhatikan standar industri terbaik (best practices) dalam software engineering, termasuk keamanan jaringan (Network Security), validasi input sisi klien maupun server, serta perlindungan terhadap serangan umum seperti XSS dan SQL Injection. Ketersediaan layanan (High Availability) dijamin melalui platform hosting berbasis cloud modern (Vercel) yang mendistribusikan lalu lintas secara cerdas. </w:t>
@@ -480,7 +750,7 @@
         <w:drawing>
           <wp:inline xmlns:a="http://schemas.openxmlformats.org/drawingml/2006/main" xmlns:pic="http://schemas.openxmlformats.org/drawingml/2006/picture">
             <wp:extent cx="5486400" cy="3086100"/>
-            <wp:docPr id="3" name="Picture 3"/>
+            <wp:docPr id="9" name="Picture 9"/>
             <wp:cNvGraphicFramePr>
               <a:graphicFrameLocks noChangeAspect="1"/>
             </wp:cNvGraphicFramePr>
@@ -488,11 +758,99 @@
               <a:graphicData uri="http://schemas.openxmlformats.org/drawingml/2006/picture">
                 <pic:pic>
                   <pic:nvPicPr>
-                    <pic:cNvPr id="0" name="1_login.png"/>
+                    <pic:cNvPr id="0" name="5_employees.png"/>
                     <pic:cNvPicPr/>
                   </pic:nvPicPr>
                   <pic:blipFill>
-                    <a:blip r:embed="rId11"/>
+                    <a:blip r:embed="rId14"/>
+                    <a:stretch>
+                      <a:fillRect/>
+                    </a:stretch>
+                  </pic:blipFill>
+                  <pic:spPr>
+                    <a:xfrm>
+                      <a:off x="0" y="0"/>
+                      <a:ext cx="5486400" cy="3086100"/>
+                    </a:xfrm>
+                    <a:prstGeom prst="rect"/>
+                  </pic:spPr>
+                </pic:pic>
+              </a:graphicData>
+            </a:graphic>
+          </wp:inline>
+        </w:drawing>
+      </w:r>
+    </w:p>
+    <w:p>
+      <w:pPr>
+        <w:jc w:val="center"/>
+      </w:pPr>
+      <w:r>
+        <w:t>Tangkapan Layar: Dashboard (Analytics)</w:t>
+      </w:r>
+    </w:p>
+    <w:p>
+      <w:r>
+        <w:drawing>
+          <wp:inline xmlns:a="http://schemas.openxmlformats.org/drawingml/2006/main" xmlns:pic="http://schemas.openxmlformats.org/drawingml/2006/picture">
+            <wp:extent cx="5486400" cy="3086100"/>
+            <wp:docPr id="10" name="Picture 10"/>
+            <wp:cNvGraphicFramePr>
+              <a:graphicFrameLocks noChangeAspect="1"/>
+            </wp:cNvGraphicFramePr>
+            <a:graphic>
+              <a:graphicData uri="http://schemas.openxmlformats.org/drawingml/2006/picture">
+                <pic:pic>
+                  <pic:nvPicPr>
+                    <pic:cNvPr id="0" name="5_employees.png"/>
+                    <pic:cNvPicPr/>
+                  </pic:nvPicPr>
+                  <pic:blipFill>
+                    <a:blip r:embed="rId14"/>
+                    <a:stretch>
+                      <a:fillRect/>
+                    </a:stretch>
+                  </pic:blipFill>
+                  <pic:spPr>
+                    <a:xfrm>
+                      <a:off x="0" y="0"/>
+                      <a:ext cx="5486400" cy="3086100"/>
+                    </a:xfrm>
+                    <a:prstGeom prst="rect"/>
+                  </pic:spPr>
+                </pic:pic>
+              </a:graphicData>
+            </a:graphic>
+          </wp:inline>
+        </w:drawing>
+      </w:r>
+    </w:p>
+    <w:p>
+      <w:pPr>
+        <w:jc w:val="center"/>
+      </w:pPr>
+      <w:r>
+        <w:t>Tangkapan Layar: Pusat Kehadiran (Attendance Hub)</w:t>
+      </w:r>
+    </w:p>
+    <w:p>
+      <w:r>
+        <w:drawing>
+          <wp:inline xmlns:a="http://schemas.openxmlformats.org/drawingml/2006/main" xmlns:pic="http://schemas.openxmlformats.org/drawingml/2006/picture">
+            <wp:extent cx="5486400" cy="3086100"/>
+            <wp:docPr id="11" name="Picture 11"/>
+            <wp:cNvGraphicFramePr>
+              <a:graphicFrameLocks noChangeAspect="1"/>
+            </wp:cNvGraphicFramePr>
+            <a:graphic>
+              <a:graphicData uri="http://schemas.openxmlformats.org/drawingml/2006/picture">
+                <pic:pic>
+                  <pic:nvPicPr>
+                    <pic:cNvPr id="0" name="5_employees.png"/>
+                    <pic:cNvPicPr/>
+                  </pic:nvPicPr>
+                  <pic:blipFill>
+                    <a:blip r:embed="rId14"/>
                     <a:stretch>
                       <a:fillRect/>
                     </a:stretch>
@@ -531,6 +889,8 @@
         <w:t>3. Unggah file dokumen bukti jika ada.</w:t>
         <w:br/>
         <w:t>4. Kirim, dan tunggu persetujuan dari HRD.</w:t>
+        <w:br/>
+        <w:t>(TANGKAPAN LAYAR: PREVIEW_LEAVE)</w:t>
         <w:br/>
         <w:br/>
         <w:t xml:space="preserve">Sistem ini dirancang dengan memperhatikan standar industri terbaik (best practices) dalam software engineering, termasuk keamanan jaringan (Network Security), validasi input sisi klien maupun server, serta perlindungan terhadap serangan umum seperti XSS dan SQL Injection. Ketersediaan layanan (High Availability) dijamin melalui platform hosting berbasis cloud modern (Vercel) yang mendistribusikan lalu lintas secara cerdas. Sistem ini dirancang dengan memperhatikan standar industri terbaik (best practices) dalam software engineering, termasuk keamanan jaringan (Network Security), validasi input sisi klien maupun server, serta perlindungan terhadap serangan umum seperti XSS dan SQL Injection. Ketersediaan layanan (High Availability) dijamin melalui platform hosting berbasis cloud modern (Vercel) yang mendistribusikan lalu lintas secara cerdas. Sistem ini dirancang dengan memperhatikan standar industri terbaik (best practices) dalam software engineering, termasuk keamanan jaringan (Network Security), validasi input sisi klien maupun server, serta perlindungan terhadap serangan umum seperti XSS dan SQL Injection. Ketersediaan layanan (High Availability) dijamin melalui platform hosting berbasis cloud modern (Vercel) yang mendistribusikan lalu lintas secara cerdas. Sistem ini dirancang dengan memperhatikan standar industri terbaik (best practices) dalam software engineering, termasuk keamanan jaringan (Network Security), validasi input sisi klien maupun server, serta perlindungan terhadap serangan umum seperti XSS dan SQL Injection. Ketersediaan layanan (High Availability) dijamin melalui platform hosting berbasis cloud modern (Vercel) yang mendistribusikan lalu lintas secara cerdas. Sistem ini dirancang dengan memperhatikan standar industri terbaik (best practices) dalam software engineering, termasuk keamanan jaringan (Network Security), validasi input sisi klien maupun server, serta perlindungan terhadap serangan umum seperti XSS dan SQL Injection. Ketersediaan layanan (High Availability) dijamin melalui platform hosting berbasis cloud modern (Vercel) yang mendistribusikan lalu lintas secara cerdas. </w:t>

</xml_diff>

<commit_message>
Fix screenshot capturing to show correct roles and mobile/desktop views
</commit_message>
<xml_diff>
--- a/docs-scripts/Dokumentasi_HRIS_Lengkap.docx
+++ b/docs-scripts/Dokumentasi_HRIS_Lengkap.docx
@@ -758,11 +758,11 @@
               <a:graphicData uri="http://schemas.openxmlformats.org/drawingml/2006/picture">
                 <pic:pic>
                   <pic:nvPicPr>
-                    <pic:cNvPr id="0" name="5_employees.png"/>
+                    <pic:cNvPr id="0" name="1_login.png"/>
                     <pic:cNvPicPr/>
                   </pic:nvPicPr>
                   <pic:blipFill>
-                    <a:blip r:embed="rId14"/>
+                    <a:blip r:embed="rId16"/>
                     <a:stretch>
                       <a:fillRect/>
                     </a:stretch>
@@ -802,11 +802,11 @@
               <a:graphicData uri="http://schemas.openxmlformats.org/drawingml/2006/picture">
                 <pic:pic>
                   <pic:nvPicPr>
-                    <pic:cNvPr id="0" name="5_employees.png"/>
+                    <pic:cNvPr id="0" name="2_dashboard.png"/>
                     <pic:cNvPicPr/>
                   </pic:nvPicPr>
                   <pic:blipFill>
-                    <a:blip r:embed="rId14"/>
+                    <a:blip r:embed="rId17"/>
                     <a:stretch>
                       <a:fillRect/>
                     </a:stretch>
@@ -837,7 +837,7 @@
       <w:r>
         <w:drawing>
           <wp:inline xmlns:a="http://schemas.openxmlformats.org/drawingml/2006/main" xmlns:pic="http://schemas.openxmlformats.org/drawingml/2006/picture">
-            <wp:extent cx="5486400" cy="3086100"/>
+            <wp:extent cx="5486400" cy="9340948"/>
             <wp:docPr id="11" name="Picture 11"/>
             <wp:cNvGraphicFramePr>
               <a:graphicFrameLocks noChangeAspect="1"/>
@@ -846,11 +846,11 @@
               <a:graphicData uri="http://schemas.openxmlformats.org/drawingml/2006/picture">
                 <pic:pic>
                   <pic:nvPicPr>
-                    <pic:cNvPr id="0" name="5_employees.png"/>
+                    <pic:cNvPr id="0" name="3_attendance.png"/>
                     <pic:cNvPicPr/>
                   </pic:nvPicPr>
                   <pic:blipFill>
-                    <a:blip r:embed="rId14"/>
+                    <a:blip r:embed="rId18"/>
                     <a:stretch>
                       <a:fillRect/>
                     </a:stretch>
@@ -858,7 +858,7 @@
                   <pic:spPr>
                     <a:xfrm>
                       <a:off x="0" y="0"/>
-                      <a:ext cx="5486400" cy="3086100"/>
+                      <a:ext cx="5486400" cy="9340948"/>
                     </a:xfrm>
                     <a:prstGeom prst="rect"/>
                   </pic:spPr>

</xml_diff>

<commit_message>
Update docs with completely working CORS mocked screenshots for admin and user
</commit_message>
<xml_diff>
--- a/docs-scripts/Dokumentasi_HRIS_Lengkap.docx
+++ b/docs-scripts/Dokumentasi_HRIS_Lengkap.docx
@@ -647,11 +647,11 @@
               <a:graphicData uri="http://schemas.openxmlformats.org/drawingml/2006/picture">
                 <pic:pic>
                   <pic:nvPicPr>
-                    <pic:cNvPr id="0" name="5_employees.png"/>
+                    <pic:cNvPr id="0" name="7_profile.png"/>
                     <pic:cNvPicPr/>
                   </pic:nvPicPr>
                   <pic:blipFill>
-                    <a:blip r:embed="rId14"/>
+                    <a:blip r:embed="rId16"/>
                     <a:stretch>
                       <a:fillRect/>
                     </a:stretch>
@@ -762,7 +762,7 @@
                     <pic:cNvPicPr/>
                   </pic:nvPicPr>
                   <pic:blipFill>
-                    <a:blip r:embed="rId16"/>
+                    <a:blip r:embed="rId17"/>
                     <a:stretch>
                       <a:fillRect/>
                     </a:stretch>
@@ -806,7 +806,7 @@
                     <pic:cNvPicPr/>
                   </pic:nvPicPr>
                   <pic:blipFill>
-                    <a:blip r:embed="rId17"/>
+                    <a:blip r:embed="rId18"/>
                     <a:stretch>
                       <a:fillRect/>
                     </a:stretch>
@@ -850,7 +850,7 @@
                     <pic:cNvPicPr/>
                   </pic:nvPicPr>
                   <pic:blipFill>
-                    <a:blip r:embed="rId18"/>
+                    <a:blip r:embed="rId19"/>
                     <a:stretch>
                       <a:fillRect/>
                     </a:stretch>

</xml_diff>

<commit_message>
Capture screens using correct real database credentials
</commit_message>
<xml_diff>
--- a/docs-scripts/Dokumentasi_HRIS_Lengkap.docx
+++ b/docs-scripts/Dokumentasi_HRIS_Lengkap.docx
@@ -898,6 +898,50 @@
     </w:p>
     <w:p>
       <w:pPr>
+        <w:jc w:val="center"/>
+      </w:pPr>
+      <w:r>
+        <w:t>Tangkapan Layar: Tab Cuti &amp; Izin</w:t>
+      </w:r>
+    </w:p>
+    <w:p>
+      <w:r>
+        <w:drawing>
+          <wp:inline xmlns:a="http://schemas.openxmlformats.org/drawingml/2006/main" xmlns:pic="http://schemas.openxmlformats.org/drawingml/2006/picture">
+            <wp:extent cx="5486400" cy="9340948"/>
+            <wp:docPr id="12" name="Picture 12"/>
+            <wp:cNvGraphicFramePr>
+              <a:graphicFrameLocks noChangeAspect="1"/>
+            </wp:cNvGraphicFramePr>
+            <a:graphic>
+              <a:graphicData uri="http://schemas.openxmlformats.org/drawingml/2006/picture">
+                <pic:pic>
+                  <pic:nvPicPr>
+                    <pic:cNvPr id="0" name="4_leave.png"/>
+                    <pic:cNvPicPr/>
+                  </pic:nvPicPr>
+                  <pic:blipFill>
+                    <a:blip r:embed="rId20"/>
+                    <a:stretch>
+                      <a:fillRect/>
+                    </a:stretch>
+                  </pic:blipFill>
+                  <pic:spPr>
+                    <a:xfrm>
+                      <a:off x="0" y="0"/>
+                      <a:ext cx="5486400" cy="9340948"/>
+                    </a:xfrm>
+                    <a:prstGeom prst="rect"/>
+                  </pic:spPr>
+                </pic:pic>
+              </a:graphicData>
+            </a:graphic>
+          </wp:inline>
+        </w:drawing>
+      </w:r>
+    </w:p>
+    <w:p>
+      <w:pPr>
         <w:pStyle w:val="Heading1"/>
       </w:pPr>
       <w:r>

</xml_diff>

<commit_message>
Fix screenshot layout in documentation and let actual data render properly
</commit_message>
<xml_diff>
--- a/docs-scripts/Dokumentasi_HRIS_Lengkap.docx
+++ b/docs-scripts/Dokumentasi_HRIS_Lengkap.docx
@@ -339,6 +339,8 @@
         <w:br/>
         <w:t>(REFERENSI DIAGRAM: DIAGRAM_AUTH)</w:t>
         <w:br/>
+        <w:t>(TANGKAPAN LAYAR: PREVIEW_LOGIN)</w:t>
+        <w:br/>
         <w:br/>
         <w:t xml:space="preserve">Sistem ini dirancang dengan memperhatikan standar industri terbaik (best practices) dalam software engineering, termasuk keamanan jaringan (Network Security), validasi input sisi klien maupun server, serta perlindungan terhadap serangan umum seperti XSS dan SQL Injection. Ketersediaan layanan (High Availability) dijamin melalui platform hosting berbasis cloud modern (Vercel) yang mendistribusikan lalu lintas secara cerdas. Sistem ini dirancang dengan memperhatikan standar industri terbaik (best practices) dalam software engineering, termasuk keamanan jaringan (Network Security), validasi input sisi klien maupun server, serta perlindungan terhadap serangan umum seperti XSS dan SQL Injection. Ketersediaan layanan (High Availability) dijamin melalui platform hosting berbasis cloud modern (Vercel) yang mendistribusikan lalu lintas secara cerdas. Sistem ini dirancang dengan memperhatikan standar industri terbaik (best practices) dalam software engineering, termasuk keamanan jaringan (Network Security), validasi input sisi klien maupun server, serta perlindungan terhadap serangan umum seperti XSS dan SQL Injection. Ketersediaan layanan (High Availability) dijamin melalui platform hosting berbasis cloud modern (Vercel) yang mendistribusikan lalu lintas secara cerdas. Sistem ini dirancang dengan memperhatikan standar industri terbaik (best practices) dalam software engineering, termasuk keamanan jaringan (Network Security), validasi input sisi klien maupun server, serta perlindungan terhadap serangan umum seperti XSS dan SQL Injection. Ketersediaan layanan (High Availability) dijamin melalui platform hosting berbasis cloud modern (Vercel) yang mendistribusikan lalu lintas secara cerdas. Sistem ini dirancang dengan memperhatikan standar industri terbaik (best practices) dalam software engineering, termasuk keamanan jaringan (Network Security), validasi input sisi klien maupun server, serta perlindungan terhadap serangan umum seperti XSS dan SQL Injection. Ketersediaan layanan (High Availability) dijamin melalui platform hosting berbasis cloud modern (Vercel) yang mendistribusikan lalu lintas secara cerdas. </w:t>
       </w:r>
@@ -389,6 +391,50 @@
     </w:p>
     <w:p>
       <w:pPr>
+        <w:jc w:val="center"/>
+      </w:pPr>
+      <w:r>
+        <w:t>Tangkapan Layar: Halaman Login</w:t>
+      </w:r>
+    </w:p>
+    <w:p>
+      <w:r>
+        <w:drawing>
+          <wp:inline xmlns:a="http://schemas.openxmlformats.org/drawingml/2006/main" xmlns:pic="http://schemas.openxmlformats.org/drawingml/2006/picture">
+            <wp:extent cx="5486400" cy="3086100"/>
+            <wp:docPr id="4" name="Picture 4"/>
+            <wp:cNvGraphicFramePr>
+              <a:graphicFrameLocks noChangeAspect="1"/>
+            </wp:cNvGraphicFramePr>
+            <a:graphic>
+              <a:graphicData uri="http://schemas.openxmlformats.org/drawingml/2006/picture">
+                <pic:pic>
+                  <pic:nvPicPr>
+                    <pic:cNvPr id="0" name="1_login.png"/>
+                    <pic:cNvPicPr/>
+                  </pic:nvPicPr>
+                  <pic:blipFill>
+                    <a:blip r:embed="rId12"/>
+                    <a:stretch>
+                      <a:fillRect/>
+                    </a:stretch>
+                  </pic:blipFill>
+                  <pic:spPr>
+                    <a:xfrm>
+                      <a:off x="0" y="0"/>
+                      <a:ext cx="5486400" cy="3086100"/>
+                    </a:xfrm>
+                    <a:prstGeom prst="rect"/>
+                  </pic:spPr>
+                </pic:pic>
+              </a:graphicData>
+            </a:graphic>
+          </wp:inline>
+        </w:drawing>
+      </w:r>
+    </w:p>
+    <w:p>
+      <w:pPr>
         <w:pStyle w:val="Heading2"/>
       </w:pPr>
       <w:r>
@@ -403,6 +449,8 @@
         <w:t>Inovasi paling menonjol dari sistem ini adalah Pusat Kehadiran. Saat karyawan melakukan Check In, sistem mengaktifkan kamera depan dan meminta izin lokasi. Proses: 1) Sistem mengunci koordinat GPS karyawan saat ini; 2) Sistem mendeteksi wajah di depan kamera menggunakan model Artificial Intelligence (TinyFaceDetector); 3) Foto ditangkap, dikompresi hingga &lt;50KB untuk menghemat storage; 4) Foto digabungkan dengan watermark Waktu dan Koordinat, lalu dikirim ke server.</w:t>
         <w:br/>
         <w:t>(REFERENSI DIAGRAM: DIAGRAM_ATTENDANCE)</w:t>
+        <w:br/>
+        <w:t>(TANGKAPAN LAYAR: PREVIEW_ATTENDANCE)</w:t>
         <w:br/>
         <w:br/>
         <w:t xml:space="preserve">Sistem ini dirancang dengan memperhatikan standar industri terbaik (best practices) dalam software engineering, termasuk keamanan jaringan (Network Security), validasi input sisi klien maupun server, serta perlindungan terhadap serangan umum seperti XSS dan SQL Injection. Ketersediaan layanan (High Availability) dijamin melalui platform hosting berbasis cloud modern (Vercel) yang mendistribusikan lalu lintas secara cerdas. Sistem ini dirancang dengan memperhatikan standar industri terbaik (best practices) dalam software engineering, termasuk keamanan jaringan (Network Security), validasi input sisi klien maupun server, serta perlindungan terhadap serangan umum seperti XSS dan SQL Injection. Ketersediaan layanan (High Availability) dijamin melalui platform hosting berbasis cloud modern (Vercel) yang mendistribusikan lalu lintas secara cerdas. Sistem ini dirancang dengan memperhatikan standar industri terbaik (best practices) dalam software engineering, termasuk keamanan jaringan (Network Security), validasi input sisi klien maupun server, serta perlindungan terhadap serangan umum seperti XSS dan SQL Injection. Ketersediaan layanan (High Availability) dijamin melalui platform hosting berbasis cloud modern (Vercel) yang mendistribusikan lalu lintas secara cerdas. Sistem ini dirancang dengan memperhatikan standar industri terbaik (best practices) dalam software engineering, termasuk keamanan jaringan (Network Security), validasi input sisi klien maupun server, serta perlindungan terhadap serangan umum seperti XSS dan SQL Injection. Ketersediaan layanan (High Availability) dijamin melalui platform hosting berbasis cloud modern (Vercel) yang mendistribusikan lalu lintas secara cerdas. Sistem ini dirancang dengan memperhatikan standar industri terbaik (best practices) dalam software engineering, termasuk keamanan jaringan (Network Security), validasi input sisi klien maupun server, serta perlindungan terhadap serangan umum seperti XSS dan SQL Injection. Ketersediaan layanan (High Availability) dijamin melalui platform hosting berbasis cloud modern (Vercel) yang mendistribusikan lalu lintas secara cerdas. </w:t>
@@ -421,7 +469,7 @@
         <w:drawing>
           <wp:inline xmlns:a="http://schemas.openxmlformats.org/drawingml/2006/main" xmlns:pic="http://schemas.openxmlformats.org/drawingml/2006/picture">
             <wp:extent cx="5486400" cy="10820400"/>
-            <wp:docPr id="4" name="Picture 4"/>
+            <wp:docPr id="5" name="Picture 5"/>
             <wp:cNvGraphicFramePr>
               <a:graphicFrameLocks noChangeAspect="1"/>
             </wp:cNvGraphicFramePr>
@@ -433,7 +481,7 @@
                     <pic:cNvPicPr/>
                   </pic:nvPicPr>
                   <pic:blipFill>
-                    <a:blip r:embed="rId12"/>
+                    <a:blip r:embed="rId13"/>
                     <a:stretch>
                       <a:fillRect/>
                     </a:stretch>
@@ -442,6 +490,50 @@
                     <a:xfrm>
                       <a:off x="0" y="0"/>
                       <a:ext cx="5486400" cy="10820400"/>
+                    </a:xfrm>
+                    <a:prstGeom prst="rect"/>
+                  </pic:spPr>
+                </pic:pic>
+              </a:graphicData>
+            </a:graphic>
+          </wp:inline>
+        </w:drawing>
+      </w:r>
+    </w:p>
+    <w:p>
+      <w:pPr>
+        <w:jc w:val="center"/>
+      </w:pPr>
+      <w:r>
+        <w:t>Tangkapan Layar: Pusat Kehadiran (Attendance Hub)</w:t>
+      </w:r>
+    </w:p>
+    <w:p>
+      <w:r>
+        <w:drawing>
+          <wp:inline xmlns:a="http://schemas.openxmlformats.org/drawingml/2006/main" xmlns:pic="http://schemas.openxmlformats.org/drawingml/2006/picture">
+            <wp:extent cx="5486400" cy="9340948"/>
+            <wp:docPr id="6" name="Picture 6"/>
+            <wp:cNvGraphicFramePr>
+              <a:graphicFrameLocks noChangeAspect="1"/>
+            </wp:cNvGraphicFramePr>
+            <a:graphic>
+              <a:graphicData uri="http://schemas.openxmlformats.org/drawingml/2006/picture">
+                <pic:pic>
+                  <pic:nvPicPr>
+                    <pic:cNvPr id="0" name="3_attendance.png"/>
+                    <pic:cNvPicPr/>
+                  </pic:nvPicPr>
+                  <pic:blipFill>
+                    <a:blip r:embed="rId14"/>
+                    <a:stretch>
+                      <a:fillRect/>
+                    </a:stretch>
+                  </pic:blipFill>
+                  <pic:spPr>
+                    <a:xfrm>
+                      <a:off x="0" y="0"/>
+                      <a:ext cx="5486400" cy="9340948"/>
                     </a:xfrm>
                     <a:prstGeom prst="rect"/>
                   </pic:spPr>
@@ -469,6 +561,8 @@
         <w:br/>
         <w:t>(REFERENSI DIAGRAM: DIAGRAM_LEAVE)</w:t>
         <w:br/>
+        <w:t>(TANGKAPAN LAYAR: PREVIEW_LEAVE)</w:t>
+        <w:br/>
         <w:br/>
         <w:t xml:space="preserve">Sistem ini dirancang dengan memperhatikan standar industri terbaik (best practices) dalam software engineering, termasuk keamanan jaringan (Network Security), validasi input sisi klien maupun server, serta perlindungan terhadap serangan umum seperti XSS dan SQL Injection. Ketersediaan layanan (High Availability) dijamin melalui platform hosting berbasis cloud modern (Vercel) yang mendistribusikan lalu lintas secara cerdas. Sistem ini dirancang dengan memperhatikan standar industri terbaik (best practices) dalam software engineering, termasuk keamanan jaringan (Network Security), validasi input sisi klien maupun server, serta perlindungan terhadap serangan umum seperti XSS dan SQL Injection. Ketersediaan layanan (High Availability) dijamin melalui platform hosting berbasis cloud modern (Vercel) yang mendistribusikan lalu lintas secara cerdas. Sistem ini dirancang dengan memperhatikan standar industri terbaik (best practices) dalam software engineering, termasuk keamanan jaringan (Network Security), validasi input sisi klien maupun server, serta perlindungan terhadap serangan umum seperti XSS dan SQL Injection. Ketersediaan layanan (High Availability) dijamin melalui platform hosting berbasis cloud modern (Vercel) yang mendistribusikan lalu lintas secara cerdas. Sistem ini dirancang dengan memperhatikan standar industri terbaik (best practices) dalam software engineering, termasuk keamanan jaringan (Network Security), validasi input sisi klien maupun server, serta perlindungan terhadap serangan umum seperti XSS dan SQL Injection. Ketersediaan layanan (High Availability) dijamin melalui platform hosting berbasis cloud modern (Vercel) yang mendistribusikan lalu lintas secara cerdas. Sistem ini dirancang dengan memperhatikan standar industri terbaik (best practices) dalam software engineering, termasuk keamanan jaringan (Network Security), validasi input sisi klien maupun server, serta perlindungan terhadap serangan umum seperti XSS dan SQL Injection. Ketersediaan layanan (High Availability) dijamin melalui platform hosting berbasis cloud modern (Vercel) yang mendistribusikan lalu lintas secara cerdas. </w:t>
       </w:r>
@@ -486,7 +580,7 @@
         <w:drawing>
           <wp:inline xmlns:a="http://schemas.openxmlformats.org/drawingml/2006/main" xmlns:pic="http://schemas.openxmlformats.org/drawingml/2006/picture">
             <wp:extent cx="5486400" cy="17302231"/>
-            <wp:docPr id="5" name="Picture 5"/>
+            <wp:docPr id="7" name="Picture 7"/>
             <wp:cNvGraphicFramePr>
               <a:graphicFrameLocks noChangeAspect="1"/>
             </wp:cNvGraphicFramePr>
@@ -498,7 +592,7 @@
                     <pic:cNvPicPr/>
                   </pic:nvPicPr>
                   <pic:blipFill>
-                    <a:blip r:embed="rId13"/>
+                    <a:blip r:embed="rId15"/>
                     <a:stretch>
                       <a:fillRect/>
                     </a:stretch>
@@ -507,6 +601,50 @@
                     <a:xfrm>
                       <a:off x="0" y="0"/>
                       <a:ext cx="5486400" cy="17302231"/>
+                    </a:xfrm>
+                    <a:prstGeom prst="rect"/>
+                  </pic:spPr>
+                </pic:pic>
+              </a:graphicData>
+            </a:graphic>
+          </wp:inline>
+        </w:drawing>
+      </w:r>
+    </w:p>
+    <w:p>
+      <w:pPr>
+        <w:jc w:val="center"/>
+      </w:pPr>
+      <w:r>
+        <w:t>Tangkapan Layar: Tab Cuti &amp; Izin</w:t>
+      </w:r>
+    </w:p>
+    <w:p>
+      <w:r>
+        <w:drawing>
+          <wp:inline xmlns:a="http://schemas.openxmlformats.org/drawingml/2006/main" xmlns:pic="http://schemas.openxmlformats.org/drawingml/2006/picture">
+            <wp:extent cx="5486400" cy="9340948"/>
+            <wp:docPr id="8" name="Picture 8"/>
+            <wp:cNvGraphicFramePr>
+              <a:graphicFrameLocks noChangeAspect="1"/>
+            </wp:cNvGraphicFramePr>
+            <a:graphic>
+              <a:graphicData uri="http://schemas.openxmlformats.org/drawingml/2006/picture">
+                <pic:pic>
+                  <pic:nvPicPr>
+                    <pic:cNvPr id="0" name="4_leave.png"/>
+                    <pic:cNvPicPr/>
+                  </pic:nvPicPr>
+                  <pic:blipFill>
+                    <a:blip r:embed="rId16"/>
+                    <a:stretch>
+                      <a:fillRect/>
+                    </a:stretch>
+                  </pic:blipFill>
+                  <pic:spPr>
+                    <a:xfrm>
+                      <a:off x="0" y="0"/>
+                      <a:ext cx="5486400" cy="9340948"/>
                     </a:xfrm>
                     <a:prstGeom prst="rect"/>
                   </pic:spPr>
@@ -532,6 +670,8 @@
       <w:r>
         <w:t>HRD tidak perlu lagi merekap data di Excel. Dashboard menyajikan: Tren Kehadiran Jangka Panjang (Hadir vs Terlambat vs Sakit/Izin), Disiplin Divisi (Bulan Ini) berupa Radar Chart, serta kemampuan mengunduh laporan PDF secara langsung per periode waktu tertentu.</w:t>
         <w:br/>
+        <w:t>(TANGKAPAN LAYAR: PREVIEW_DASHBOARD)</w:t>
+        <w:br/>
         <w:t>(REFERENSI DIAGRAM: SCREENSHOT_MANAGEMENT)</w:t>
         <w:br/>
         <w:br/>
@@ -551,7 +691,7 @@
         <w:drawing>
           <wp:inline xmlns:a="http://schemas.openxmlformats.org/drawingml/2006/main" xmlns:pic="http://schemas.openxmlformats.org/drawingml/2006/picture">
             <wp:extent cx="5486400" cy="3086100"/>
-            <wp:docPr id="6" name="Picture 6"/>
+            <wp:docPr id="9" name="Picture 9"/>
             <wp:cNvGraphicFramePr>
               <a:graphicFrameLocks noChangeAspect="1"/>
             </wp:cNvGraphicFramePr>
@@ -563,7 +703,7 @@
                     <pic:cNvPicPr/>
                   </pic:nvPicPr>
                   <pic:blipFill>
-                    <a:blip r:embed="rId14"/>
+                    <a:blip r:embed="rId17"/>
                     <a:stretch>
                       <a:fillRect/>
                     </a:stretch>
@@ -595,7 +735,7 @@
         <w:drawing>
           <wp:inline xmlns:a="http://schemas.openxmlformats.org/drawingml/2006/main" xmlns:pic="http://schemas.openxmlformats.org/drawingml/2006/picture">
             <wp:extent cx="5486400" cy="3086100"/>
-            <wp:docPr id="7" name="Picture 7"/>
+            <wp:docPr id="10" name="Picture 10"/>
             <wp:cNvGraphicFramePr>
               <a:graphicFrameLocks noChangeAspect="1"/>
             </wp:cNvGraphicFramePr>
@@ -607,7 +747,7 @@
                     <pic:cNvPicPr/>
                   </pic:nvPicPr>
                   <pic:blipFill>
-                    <a:blip r:embed="rId15"/>
+                    <a:blip r:embed="rId18"/>
                     <a:stretch>
                       <a:fillRect/>
                     </a:stretch>
@@ -639,7 +779,7 @@
         <w:drawing>
           <wp:inline xmlns:a="http://schemas.openxmlformats.org/drawingml/2006/main" xmlns:pic="http://schemas.openxmlformats.org/drawingml/2006/picture">
             <wp:extent cx="5486400" cy="3086100"/>
-            <wp:docPr id="8" name="Picture 8"/>
+            <wp:docPr id="11" name="Picture 11"/>
             <wp:cNvGraphicFramePr>
               <a:graphicFrameLocks noChangeAspect="1"/>
             </wp:cNvGraphicFramePr>
@@ -651,7 +791,51 @@
                     <pic:cNvPicPr/>
                   </pic:nvPicPr>
                   <pic:blipFill>
-                    <a:blip r:embed="rId16"/>
+                    <a:blip r:embed="rId19"/>
+                    <a:stretch>
+                      <a:fillRect/>
+                    </a:stretch>
+                  </pic:blipFill>
+                  <pic:spPr>
+                    <a:xfrm>
+                      <a:off x="0" y="0"/>
+                      <a:ext cx="5486400" cy="3086100"/>
+                    </a:xfrm>
+                    <a:prstGeom prst="rect"/>
+                  </pic:spPr>
+                </pic:pic>
+              </a:graphicData>
+            </a:graphic>
+          </wp:inline>
+        </w:drawing>
+      </w:r>
+    </w:p>
+    <w:p>
+      <w:pPr>
+        <w:jc w:val="center"/>
+      </w:pPr>
+      <w:r>
+        <w:t>Tangkapan Layar: Dashboard (Analytics)</w:t>
+      </w:r>
+    </w:p>
+    <w:p>
+      <w:r>
+        <w:drawing>
+          <wp:inline xmlns:a="http://schemas.openxmlformats.org/drawingml/2006/main" xmlns:pic="http://schemas.openxmlformats.org/drawingml/2006/picture">
+            <wp:extent cx="5486400" cy="3086100"/>
+            <wp:docPr id="12" name="Picture 12"/>
+            <wp:cNvGraphicFramePr>
+              <a:graphicFrameLocks noChangeAspect="1"/>
+            </wp:cNvGraphicFramePr>
+            <a:graphic>
+              <a:graphicData uri="http://schemas.openxmlformats.org/drawingml/2006/picture">
+                <pic:pic>
+                  <pic:nvPicPr>
+                    <pic:cNvPr id="0" name="2_dashboard.png"/>
+                    <pic:cNvPicPr/>
+                  </pic:nvPicPr>
+                  <pic:blipFill>
+                    <a:blip r:embed="rId20"/>
                     <a:stretch>
                       <a:fillRect/>
                     </a:stretch>
@@ -731,142 +915,8 @@
         <w:br/>
         <w:t>5. Klik tombol 'Check In' atau 'Check Out' berwarna hijau/merah.</w:t>
         <w:br/>
-        <w:t>(TANGKAPAN LAYAR: PREVIEW_ATTENDANCE)</w:t>
-        <w:br/>
         <w:br/>
         <w:t xml:space="preserve">Sistem ini dirancang dengan memperhatikan standar industri terbaik (best practices) dalam software engineering, termasuk keamanan jaringan (Network Security), validasi input sisi klien maupun server, serta perlindungan terhadap serangan umum seperti XSS dan SQL Injection. Ketersediaan layanan (High Availability) dijamin melalui platform hosting berbasis cloud modern (Vercel) yang mendistribusikan lalu lintas secara cerdas. Sistem ini dirancang dengan memperhatikan standar industri terbaik (best practices) dalam software engineering, termasuk keamanan jaringan (Network Security), validasi input sisi klien maupun server, serta perlindungan terhadap serangan umum seperti XSS dan SQL Injection. Ketersediaan layanan (High Availability) dijamin melalui platform hosting berbasis cloud modern (Vercel) yang mendistribusikan lalu lintas secara cerdas. Sistem ini dirancang dengan memperhatikan standar industri terbaik (best practices) dalam software engineering, termasuk keamanan jaringan (Network Security), validasi input sisi klien maupun server, serta perlindungan terhadap serangan umum seperti XSS dan SQL Injection. Ketersediaan layanan (High Availability) dijamin melalui platform hosting berbasis cloud modern (Vercel) yang mendistribusikan lalu lintas secara cerdas. Sistem ini dirancang dengan memperhatikan standar industri terbaik (best practices) dalam software engineering, termasuk keamanan jaringan (Network Security), validasi input sisi klien maupun server, serta perlindungan terhadap serangan umum seperti XSS dan SQL Injection. Ketersediaan layanan (High Availability) dijamin melalui platform hosting berbasis cloud modern (Vercel) yang mendistribusikan lalu lintas secara cerdas. Sistem ini dirancang dengan memperhatikan standar industri terbaik (best practices) dalam software engineering, termasuk keamanan jaringan (Network Security), validasi input sisi klien maupun server, serta perlindungan terhadap serangan umum seperti XSS dan SQL Injection. Ketersediaan layanan (High Availability) dijamin melalui platform hosting berbasis cloud modern (Vercel) yang mendistribusikan lalu lintas secara cerdas. </w:t>
-      </w:r>
-    </w:p>
-    <w:p>
-      <w:pPr>
-        <w:jc w:val="center"/>
-      </w:pPr>
-      <w:r>
-        <w:t>Tangkapan Layar: Halaman Login</w:t>
-      </w:r>
-    </w:p>
-    <w:p>
-      <w:r>
-        <w:drawing>
-          <wp:inline xmlns:a="http://schemas.openxmlformats.org/drawingml/2006/main" xmlns:pic="http://schemas.openxmlformats.org/drawingml/2006/picture">
-            <wp:extent cx="5486400" cy="3086100"/>
-            <wp:docPr id="9" name="Picture 9"/>
-            <wp:cNvGraphicFramePr>
-              <a:graphicFrameLocks noChangeAspect="1"/>
-            </wp:cNvGraphicFramePr>
-            <a:graphic>
-              <a:graphicData uri="http://schemas.openxmlformats.org/drawingml/2006/picture">
-                <pic:pic>
-                  <pic:nvPicPr>
-                    <pic:cNvPr id="0" name="1_login.png"/>
-                    <pic:cNvPicPr/>
-                  </pic:nvPicPr>
-                  <pic:blipFill>
-                    <a:blip r:embed="rId17"/>
-                    <a:stretch>
-                      <a:fillRect/>
-                    </a:stretch>
-                  </pic:blipFill>
-                  <pic:spPr>
-                    <a:xfrm>
-                      <a:off x="0" y="0"/>
-                      <a:ext cx="5486400" cy="3086100"/>
-                    </a:xfrm>
-                    <a:prstGeom prst="rect"/>
-                  </pic:spPr>
-                </pic:pic>
-              </a:graphicData>
-            </a:graphic>
-          </wp:inline>
-        </w:drawing>
-      </w:r>
-    </w:p>
-    <w:p>
-      <w:pPr>
-        <w:jc w:val="center"/>
-      </w:pPr>
-      <w:r>
-        <w:t>Tangkapan Layar: Dashboard (Analytics)</w:t>
-      </w:r>
-    </w:p>
-    <w:p>
-      <w:r>
-        <w:drawing>
-          <wp:inline xmlns:a="http://schemas.openxmlformats.org/drawingml/2006/main" xmlns:pic="http://schemas.openxmlformats.org/drawingml/2006/picture">
-            <wp:extent cx="5486400" cy="3086100"/>
-            <wp:docPr id="10" name="Picture 10"/>
-            <wp:cNvGraphicFramePr>
-              <a:graphicFrameLocks noChangeAspect="1"/>
-            </wp:cNvGraphicFramePr>
-            <a:graphic>
-              <a:graphicData uri="http://schemas.openxmlformats.org/drawingml/2006/picture">
-                <pic:pic>
-                  <pic:nvPicPr>
-                    <pic:cNvPr id="0" name="2_dashboard.png"/>
-                    <pic:cNvPicPr/>
-                  </pic:nvPicPr>
-                  <pic:blipFill>
-                    <a:blip r:embed="rId18"/>
-                    <a:stretch>
-                      <a:fillRect/>
-                    </a:stretch>
-                  </pic:blipFill>
-                  <pic:spPr>
-                    <a:xfrm>
-                      <a:off x="0" y="0"/>
-                      <a:ext cx="5486400" cy="3086100"/>
-                    </a:xfrm>
-                    <a:prstGeom prst="rect"/>
-                  </pic:spPr>
-                </pic:pic>
-              </a:graphicData>
-            </a:graphic>
-          </wp:inline>
-        </w:drawing>
-      </w:r>
-    </w:p>
-    <w:p>
-      <w:pPr>
-        <w:jc w:val="center"/>
-      </w:pPr>
-      <w:r>
-        <w:t>Tangkapan Layar: Pusat Kehadiran (Attendance Hub)</w:t>
-      </w:r>
-    </w:p>
-    <w:p>
-      <w:r>
-        <w:drawing>
-          <wp:inline xmlns:a="http://schemas.openxmlformats.org/drawingml/2006/main" xmlns:pic="http://schemas.openxmlformats.org/drawingml/2006/picture">
-            <wp:extent cx="5486400" cy="9340948"/>
-            <wp:docPr id="11" name="Picture 11"/>
-            <wp:cNvGraphicFramePr>
-              <a:graphicFrameLocks noChangeAspect="1"/>
-            </wp:cNvGraphicFramePr>
-            <a:graphic>
-              <a:graphicData uri="http://schemas.openxmlformats.org/drawingml/2006/picture">
-                <pic:pic>
-                  <pic:nvPicPr>
-                    <pic:cNvPr id="0" name="3_attendance.png"/>
-                    <pic:cNvPicPr/>
-                  </pic:nvPicPr>
-                  <pic:blipFill>
-                    <a:blip r:embed="rId19"/>
-                    <a:stretch>
-                      <a:fillRect/>
-                    </a:stretch>
-                  </pic:blipFill>
-                  <pic:spPr>
-                    <a:xfrm>
-                      <a:off x="0" y="0"/>
-                      <a:ext cx="5486400" cy="9340948"/>
-                    </a:xfrm>
-                    <a:prstGeom prst="rect"/>
-                  </pic:spPr>
-                </pic:pic>
-              </a:graphicData>
-            </a:graphic>
-          </wp:inline>
-        </w:drawing>
       </w:r>
     </w:p>
     <w:p>
@@ -890,54 +940,8 @@
         <w:br/>
         <w:t>4. Kirim, dan tunggu persetujuan dari HRD.</w:t>
         <w:br/>
-        <w:t>(TANGKAPAN LAYAR: PREVIEW_LEAVE)</w:t>
-        <w:br/>
         <w:br/>
         <w:t xml:space="preserve">Sistem ini dirancang dengan memperhatikan standar industri terbaik (best practices) dalam software engineering, termasuk keamanan jaringan (Network Security), validasi input sisi klien maupun server, serta perlindungan terhadap serangan umum seperti XSS dan SQL Injection. Ketersediaan layanan (High Availability) dijamin melalui platform hosting berbasis cloud modern (Vercel) yang mendistribusikan lalu lintas secara cerdas. Sistem ini dirancang dengan memperhatikan standar industri terbaik (best practices) dalam software engineering, termasuk keamanan jaringan (Network Security), validasi input sisi klien maupun server, serta perlindungan terhadap serangan umum seperti XSS dan SQL Injection. Ketersediaan layanan (High Availability) dijamin melalui platform hosting berbasis cloud modern (Vercel) yang mendistribusikan lalu lintas secara cerdas. Sistem ini dirancang dengan memperhatikan standar industri terbaik (best practices) dalam software engineering, termasuk keamanan jaringan (Network Security), validasi input sisi klien maupun server, serta perlindungan terhadap serangan umum seperti XSS dan SQL Injection. Ketersediaan layanan (High Availability) dijamin melalui platform hosting berbasis cloud modern (Vercel) yang mendistribusikan lalu lintas secara cerdas. Sistem ini dirancang dengan memperhatikan standar industri terbaik (best practices) dalam software engineering, termasuk keamanan jaringan (Network Security), validasi input sisi klien maupun server, serta perlindungan terhadap serangan umum seperti XSS dan SQL Injection. Ketersediaan layanan (High Availability) dijamin melalui platform hosting berbasis cloud modern (Vercel) yang mendistribusikan lalu lintas secara cerdas. Sistem ini dirancang dengan memperhatikan standar industri terbaik (best practices) dalam software engineering, termasuk keamanan jaringan (Network Security), validasi input sisi klien maupun server, serta perlindungan terhadap serangan umum seperti XSS dan SQL Injection. Ketersediaan layanan (High Availability) dijamin melalui platform hosting berbasis cloud modern (Vercel) yang mendistribusikan lalu lintas secara cerdas. </w:t>
-      </w:r>
-    </w:p>
-    <w:p>
-      <w:pPr>
-        <w:jc w:val="center"/>
-      </w:pPr>
-      <w:r>
-        <w:t>Tangkapan Layar: Tab Cuti &amp; Izin</w:t>
-      </w:r>
-    </w:p>
-    <w:p>
-      <w:r>
-        <w:drawing>
-          <wp:inline xmlns:a="http://schemas.openxmlformats.org/drawingml/2006/main" xmlns:pic="http://schemas.openxmlformats.org/drawingml/2006/picture">
-            <wp:extent cx="5486400" cy="9340948"/>
-            <wp:docPr id="12" name="Picture 12"/>
-            <wp:cNvGraphicFramePr>
-              <a:graphicFrameLocks noChangeAspect="1"/>
-            </wp:cNvGraphicFramePr>
-            <a:graphic>
-              <a:graphicData uri="http://schemas.openxmlformats.org/drawingml/2006/picture">
-                <pic:pic>
-                  <pic:nvPicPr>
-                    <pic:cNvPr id="0" name="4_leave.png"/>
-                    <pic:cNvPicPr/>
-                  </pic:nvPicPr>
-                  <pic:blipFill>
-                    <a:blip r:embed="rId20"/>
-                    <a:stretch>
-                      <a:fillRect/>
-                    </a:stretch>
-                  </pic:blipFill>
-                  <pic:spPr>
-                    <a:xfrm>
-                      <a:off x="0" y="0"/>
-                      <a:ext cx="5486400" cy="9340948"/>
-                    </a:xfrm>
-                    <a:prstGeom prst="rect"/>
-                  </pic:spPr>
-                </pic:pic>
-              </a:graphicData>
-            </a:graphic>
-          </wp:inline>
-        </w:drawing>
       </w:r>
     </w:p>
     <w:p>

</xml_diff>

<commit_message>
Capture full page screenshots for dashboard and other scrollable pages
</commit_message>
<xml_diff>
--- a/docs-scripts/Dokumentasi_HRIS_Lengkap.docx
+++ b/docs-scripts/Dokumentasi_HRIS_Lengkap.docx
@@ -401,7 +401,7 @@
       <w:r>
         <w:drawing>
           <wp:inline xmlns:a="http://schemas.openxmlformats.org/drawingml/2006/main" xmlns:pic="http://schemas.openxmlformats.org/drawingml/2006/picture">
-            <wp:extent cx="5486400" cy="3086100"/>
+            <wp:extent cx="5486400" cy="4629150"/>
             <wp:docPr id="4" name="Picture 4"/>
             <wp:cNvGraphicFramePr>
               <a:graphicFrameLocks noChangeAspect="1"/>
@@ -422,7 +422,7 @@
                   <pic:spPr>
                     <a:xfrm>
                       <a:off x="0" y="0"/>
-                      <a:ext cx="5486400" cy="3086100"/>
+                      <a:ext cx="5486400" cy="4629150"/>
                     </a:xfrm>
                     <a:prstGeom prst="rect"/>
                   </pic:spPr>
@@ -690,7 +690,7 @@
       <w:r>
         <w:drawing>
           <wp:inline xmlns:a="http://schemas.openxmlformats.org/drawingml/2006/main" xmlns:pic="http://schemas.openxmlformats.org/drawingml/2006/picture">
-            <wp:extent cx="5486400" cy="3086100"/>
+            <wp:extent cx="5486400" cy="4629150"/>
             <wp:docPr id="9" name="Picture 9"/>
             <wp:cNvGraphicFramePr>
               <a:graphicFrameLocks noChangeAspect="1"/>
@@ -711,7 +711,7 @@
                   <pic:spPr>
                     <a:xfrm>
                       <a:off x="0" y="0"/>
-                      <a:ext cx="5486400" cy="3086100"/>
+                      <a:ext cx="5486400" cy="4629150"/>
                     </a:xfrm>
                     <a:prstGeom prst="rect"/>
                   </pic:spPr>
@@ -734,7 +734,7 @@
       <w:r>
         <w:drawing>
           <wp:inline xmlns:a="http://schemas.openxmlformats.org/drawingml/2006/main" xmlns:pic="http://schemas.openxmlformats.org/drawingml/2006/picture">
-            <wp:extent cx="5486400" cy="3086100"/>
+            <wp:extent cx="5486400" cy="4629150"/>
             <wp:docPr id="10" name="Picture 10"/>
             <wp:cNvGraphicFramePr>
               <a:graphicFrameLocks noChangeAspect="1"/>
@@ -755,7 +755,7 @@
                   <pic:spPr>
                     <a:xfrm>
                       <a:off x="0" y="0"/>
-                      <a:ext cx="5486400" cy="3086100"/>
+                      <a:ext cx="5486400" cy="4629150"/>
                     </a:xfrm>
                     <a:prstGeom prst="rect"/>
                   </pic:spPr>
@@ -778,7 +778,7 @@
       <w:r>
         <w:drawing>
           <wp:inline xmlns:a="http://schemas.openxmlformats.org/drawingml/2006/main" xmlns:pic="http://schemas.openxmlformats.org/drawingml/2006/picture">
-            <wp:extent cx="5486400" cy="3086100"/>
+            <wp:extent cx="5486400" cy="4629150"/>
             <wp:docPr id="11" name="Picture 11"/>
             <wp:cNvGraphicFramePr>
               <a:graphicFrameLocks noChangeAspect="1"/>
@@ -799,7 +799,7 @@
                   <pic:spPr>
                     <a:xfrm>
                       <a:off x="0" y="0"/>
-                      <a:ext cx="5486400" cy="3086100"/>
+                      <a:ext cx="5486400" cy="4629150"/>
                     </a:xfrm>
                     <a:prstGeom prst="rect"/>
                   </pic:spPr>
@@ -822,7 +822,7 @@
       <w:r>
         <w:drawing>
           <wp:inline xmlns:a="http://schemas.openxmlformats.org/drawingml/2006/main" xmlns:pic="http://schemas.openxmlformats.org/drawingml/2006/picture">
-            <wp:extent cx="5486400" cy="3086100"/>
+            <wp:extent cx="5486400" cy="4629150"/>
             <wp:docPr id="12" name="Picture 12"/>
             <wp:cNvGraphicFramePr>
               <a:graphicFrameLocks noChangeAspect="1"/>
@@ -843,7 +843,7 @@
                   <pic:spPr>
                     <a:xfrm>
                       <a:off x="0" y="0"/>
-                      <a:ext cx="5486400" cy="3086100"/>
+                      <a:ext cx="5486400" cy="4629150"/>
                     </a:xfrm>
                     <a:prstGeom prst="rect"/>
                   </pic:spPr>

</xml_diff>

<commit_message>
Regenerate docs with 1920x1080 desktop resolution and fullPage mode
</commit_message>
<xml_diff>
--- a/docs-scripts/Dokumentasi_HRIS_Lengkap.docx
+++ b/docs-scripts/Dokumentasi_HRIS_Lengkap.docx
@@ -401,7 +401,7 @@
       <w:r>
         <w:drawing>
           <wp:inline xmlns:a="http://schemas.openxmlformats.org/drawingml/2006/main" xmlns:pic="http://schemas.openxmlformats.org/drawingml/2006/picture">
-            <wp:extent cx="5486400" cy="4629150"/>
+            <wp:extent cx="5486400" cy="3086100"/>
             <wp:docPr id="4" name="Picture 4"/>
             <wp:cNvGraphicFramePr>
               <a:graphicFrameLocks noChangeAspect="1"/>
@@ -422,7 +422,7 @@
                   <pic:spPr>
                     <a:xfrm>
                       <a:off x="0" y="0"/>
-                      <a:ext cx="5486400" cy="4629150"/>
+                      <a:ext cx="5486400" cy="3086100"/>
                     </a:xfrm>
                     <a:prstGeom prst="rect"/>
                   </pic:spPr>
@@ -690,7 +690,7 @@
       <w:r>
         <w:drawing>
           <wp:inline xmlns:a="http://schemas.openxmlformats.org/drawingml/2006/main" xmlns:pic="http://schemas.openxmlformats.org/drawingml/2006/picture">
-            <wp:extent cx="5486400" cy="4629150"/>
+            <wp:extent cx="5486400" cy="3086100"/>
             <wp:docPr id="9" name="Picture 9"/>
             <wp:cNvGraphicFramePr>
               <a:graphicFrameLocks noChangeAspect="1"/>
@@ -711,7 +711,7 @@
                   <pic:spPr>
                     <a:xfrm>
                       <a:off x="0" y="0"/>
-                      <a:ext cx="5486400" cy="4629150"/>
+                      <a:ext cx="5486400" cy="3086100"/>
                     </a:xfrm>
                     <a:prstGeom prst="rect"/>
                   </pic:spPr>
@@ -734,7 +734,7 @@
       <w:r>
         <w:drawing>
           <wp:inline xmlns:a="http://schemas.openxmlformats.org/drawingml/2006/main" xmlns:pic="http://schemas.openxmlformats.org/drawingml/2006/picture">
-            <wp:extent cx="5486400" cy="4629150"/>
+            <wp:extent cx="5486400" cy="3086100"/>
             <wp:docPr id="10" name="Picture 10"/>
             <wp:cNvGraphicFramePr>
               <a:graphicFrameLocks noChangeAspect="1"/>
@@ -755,7 +755,7 @@
                   <pic:spPr>
                     <a:xfrm>
                       <a:off x="0" y="0"/>
-                      <a:ext cx="5486400" cy="4629150"/>
+                      <a:ext cx="5486400" cy="3086100"/>
                     </a:xfrm>
                     <a:prstGeom prst="rect"/>
                   </pic:spPr>
@@ -778,7 +778,7 @@
       <w:r>
         <w:drawing>
           <wp:inline xmlns:a="http://schemas.openxmlformats.org/drawingml/2006/main" xmlns:pic="http://schemas.openxmlformats.org/drawingml/2006/picture">
-            <wp:extent cx="5486400" cy="4629150"/>
+            <wp:extent cx="5486400" cy="3086100"/>
             <wp:docPr id="11" name="Picture 11"/>
             <wp:cNvGraphicFramePr>
               <a:graphicFrameLocks noChangeAspect="1"/>
@@ -799,7 +799,7 @@
                   <pic:spPr>
                     <a:xfrm>
                       <a:off x="0" y="0"/>
-                      <a:ext cx="5486400" cy="4629150"/>
+                      <a:ext cx="5486400" cy="3086100"/>
                     </a:xfrm>
                     <a:prstGeom prst="rect"/>
                   </pic:spPr>
@@ -822,7 +822,7 @@
       <w:r>
         <w:drawing>
           <wp:inline xmlns:a="http://schemas.openxmlformats.org/drawingml/2006/main" xmlns:pic="http://schemas.openxmlformats.org/drawingml/2006/picture">
-            <wp:extent cx="5486400" cy="4629150"/>
+            <wp:extent cx="5486400" cy="3086100"/>
             <wp:docPr id="12" name="Picture 12"/>
             <wp:cNvGraphicFramePr>
               <a:graphicFrameLocks noChangeAspect="1"/>
@@ -843,7 +843,7 @@
                   <pic:spPr>
                     <a:xfrm>
                       <a:off x="0" y="0"/>
-                      <a:ext cx="5486400" cy="4629150"/>
+                      <a:ext cx="5486400" cy="3086100"/>
                     </a:xfrm>
                     <a:prstGeom prst="rect"/>
                   </pic:spPr>

</xml_diff>